<commit_message>
docs(zone_e): specify lower floors for staff and top floor only for students
</commit_message>
<xml_diff>
--- a/docs/BAO_CAO_SRS_SO_BO_VA_WBS_NHOM_DANG_DINH_KHANG.docx
+++ b/docs/BAO_CAO_SRS_SO_BO_VA_WBS_NHOM_DANG_DINH_KHANG.docx
@@ -2725,7 +2725,7 @@
         <w:pStyle w:val="ListBullet"/>
       </w:pPr>
       <w:r>
-        <w:t>4 Khu vực đỗ xe trong trường theo thứ tự quy hoạch A - E - C - B: Gồm Khu A (Sân ngoài trời), Khu E (Nhà giữ xe nhiều tầng - CB-GV-CNV &amp; SV), Khu C (Sân ngoài trời), và Khu B (Sân ngoài trời).</w:t>
+        <w:t>4 Khu vực đỗ xe trong trường theo thứ tự quy hoạch A - E - C - B: Gồm Khu A (Sân ngoài trời), Khu E (Nhà xe kết cấu thép 4 tầng: các tầng dưới cho CB-GV-CNV, chỉ duy nhất lầu trên cùng cho sinh viên), Khu C (Sân ngoài trời), và Khu B (Sân ngoài trời).</w:t>
       </w:r>
     </w:p>
     <w:p>
@@ -2781,7 +2781,7 @@
         <w:pStyle w:val="ListBullet"/>
       </w:pPr>
       <w:r>
-        <w:t>FR 1 (Quản lý Xe vào tại Cổng 1): Tiếp nhận quẹt thẻ RFID trên 4 làn vào; phân biệt đối tượng Cán bộ - Giảng viên (miễn phí 0đ) và Sinh viên (5.000đ); Camera sau tự động chụp biển số; nhận diện ALPR; gán khu đỗ (A, E, C, B) và giảm 1 chỗ trống tương ứng; tạo vé trạng thái IN_PARKING.</w:t>
+        <w:t>FR 1 (Quản lý Xe vào tại Cổng 1): Tiếp nhận quẹt thẻ RFID trên 4 làn vào; phân biệt đối tượng Cán bộ - Giảng viên (miễn phí 0đ, tầng dưới Khu E) và Sinh viên (5.000đ, chỉ lầu trên cùng Khu E); Camera sau tự động chụp biển số; nhận diện ALPR; gán khu đỗ (A, E, C, B) và giảm 1 chỗ trống tương ứng; tạo vé trạng thái IN_PARKING.</w:t>
       </w:r>
     </w:p>
     <w:p>

</xml_diff>

<commit_message>
feat(zones): align max capacity to 2100 slots and document mobile 2-lane booth architecture
</commit_message>
<xml_diff>
--- a/docs/BAO_CAO_SRS_SO_BO_VA_WBS_NHOM_DANG_DINH_KHANG.docx
+++ b/docs/BAO_CAO_SRS_SO_BO_VA_WBS_NHOM_DANG_DINH_KHANG.docx
@@ -2725,7 +2725,7 @@
         <w:pStyle w:val="ListBullet"/>
       </w:pPr>
       <w:r>
-        <w:t>4 Khu vực đỗ xe trong trường theo thứ tự quy hoạch A - E - C - B: Gồm Khu A (Sân ngoài trời), Khu E (Nhà xe kết cấu thép 4 tầng: các tầng dưới cho CB-GV-CNV, chỉ duy nhất lầu trên cùng cho sinh viên), Khu C (Sân ngoài trời), và Khu B (Sân ngoài trời).</w:t>
+        <w:t>4 Khu vực đỗ xe trong trường theo thứ tự quy hoạch A - E - C - B (Tổng sức chứa 2.100 xe): Gồm Khu A (250 xe), Khu E (Nhà xe kết cấu thép 4 tầng - 600 xe: các tầng dưới cho CB-GV-CNV, chỉ duy nhất lầu trên cùng cho sinh viên), Khu C (450 xe), và Khu B (Đại sân trung tâm - 800 xe).</w:t>
       </w:r>
     </w:p>
     <w:p>
@@ -2757,7 +2757,7 @@
         <w:pStyle w:val="ListBullet"/>
       </w:pPr>
       <w:r>
-        <w:t>Thiết bị kiểm soát: Máy tính để bàn + 1 Camera chụp sau đuôi xe máy (Rear Camera ALPR) + Đầu đọc thẻ RFID quẹt tay.</w:t>
+        <w:t>Thiết bị &amp; Bốt kiểm soát (Control Booth): Kiosk di động khung kim loại đặt tim giữa 2 làn xe dưới mái che bạt tiền chế, trang bị màn hình POS chia camera 2 làn, đầu đọc thẻ RFID USB để bàn, rổ thẻ UTH, khay tiền mặt và gờ giảm tốc cao su vàng-đen điều tiết dừng xe.</w:t>
       </w:r>
     </w:p>
     <w:p>
@@ -2805,7 +2805,7 @@
         <w:pStyle w:val="ListBullet"/>
       </w:pPr>
       <w:r>
-        <w:t>FR 4 (Giám sát Sức chứa 4 Khu): Đếm chính xác số xe đang đỗ và số chỗ còn trống theo thời gian thực theo thứ tự A - E - C - B (Sân A, Nhà xe Khu E nhiều tầng, Sân C, Sân B); hiển thị cảnh báo đỏ khi khu đỗ đạt ngưỡng đầy.</w:t>
+        <w:t>FR 4 (Giám sát Sức chứa 4 Khu): Đếm chính xác số xe đang đỗ và số chỗ còn trống theo thời gian thực theo thứ tự A - E - C - B: Sân A (250 xe), Nhà xe Khu E (600 xe), Sân C (450 xe), Đại Sân B (800 xe) - Tổng công suất 2.100 xe máy; hiển thị cảnh báo đỏ khi khu đỗ đạt ngưỡng đầy.</w:t>
       </w:r>
     </w:p>
     <w:p>

</xml_diff>

<commit_message>
feat(zones): enforce B-C-A-E dispatch priority and add suggest_optimal_zone algorithm
</commit_message>
<xml_diff>
--- a/docs/BAO_CAO_SRS_SO_BO_VA_WBS_NHOM_DANG_DINH_KHANG.docx
+++ b/docs/BAO_CAO_SRS_SO_BO_VA_WBS_NHOM_DANG_DINH_KHANG.docx
@@ -2725,7 +2725,7 @@
         <w:pStyle w:val="ListBullet"/>
       </w:pPr>
       <w:r>
-        <w:t>4 Khu vực đỗ xe trong trường theo thứ tự quy hoạch A - E - C - B (Tổng sức chứa 2.100 xe): Gồm Khu A (250 xe), Khu E (Nhà xe kết cấu thép 4 tầng - 600 xe: các tầng dưới cho CB-GV-CNV, chỉ duy nhất lầu trên cùng cho sinh viên), Khu C (450 xe), và Khu B (Đại sân trung tâm - 800 xe).</w:t>
+        <w:t>4 Khu vực đỗ xe trong trường với thuật toán điều phối ưu tiên B - C - A - E (Tổng sức chứa 2.100 xe): Đại Sân B (800 xe - Ưu tiên 1), Sân C (450 xe - Ưu tiên 2), Sân A (250 xe - Ưu tiên 3) và Nhà xe Khu E 4 tầng (600 xe: tầng dưới CB-GV-CNV, lầu 3 cho sinh viên - Ưu tiên 4).</w:t>
       </w:r>
     </w:p>
     <w:p>
@@ -2781,7 +2781,7 @@
         <w:pStyle w:val="ListBullet"/>
       </w:pPr>
       <w:r>
-        <w:t>FR 1 (Quản lý Xe vào tại Cổng 1): Tiếp nhận quẹt thẻ RFID trên 4 làn vào; phân biệt đối tượng Cán bộ - Giảng viên (miễn phí 0đ, tầng dưới Khu E) và Sinh viên (5.000đ, chỉ lầu trên cùng Khu E); Camera sau tự động chụp biển số; nhận diện ALPR; gán khu đỗ (A, E, C, B) và giảm 1 chỗ trống tương ứng; tạo vé trạng thái IN_PARKING.</w:t>
+        <w:t>FR 1 (Quản lý Xe vào tại Cổng 1): Tiếp nhận quẹt thẻ RFID trên 4 làn vào; phân biệt đối tượng Cán bộ - Giảng viên (miễn phí 0đ, tầng dưới Khu E) và Sinh viên (5.000đ); Camera sau tự động chụp biển số; nhận diện ALPR; thuật toán tự động gán khu đỗ theo thứ tự ưu tiên B -&gt; C -&gt; A -&gt; E và giảm 1 chỗ trống tương ứng; tạo vé trạng thái IN_PARKING.</w:t>
       </w:r>
     </w:p>
     <w:p>
@@ -2805,7 +2805,7 @@
         <w:pStyle w:val="ListBullet"/>
       </w:pPr>
       <w:r>
-        <w:t>FR 4 (Giám sát Sức chứa 4 Khu): Đếm chính xác số xe đang đỗ và số chỗ còn trống theo thời gian thực theo thứ tự A - E - C - B: Sân A (250 xe), Nhà xe Khu E (600 xe), Sân C (450 xe), Đại Sân B (800 xe) - Tổng công suất 2.100 xe máy; hiển thị cảnh báo đỏ khi khu đỗ đạt ngưỡng đầy.</w:t>
+        <w:t>FR 4 (Giám sát Sức chứa 4 Khu): Đếm chính xác số xe đang đỗ và số chỗ còn trống theo thời gian thực theo thứ tự ưu tiên B -&gt; C -&gt; A -&gt; E: Đại Sân B (800 xe), Sân C (450 xe), Sân A (250 xe), Nhà xe Khu E (600 xe) - Tổng công suất 2.100 xe máy; hiển thị cảnh báo đỏ khi khu đỗ đạt ngưỡng đầy.</w:t>
       </w:r>
     </w:p>
     <w:p>

</xml_diff>

<commit_message>
docs(wbs): update WBS matrix with 2100 capacity, staff free policy, and customer display
</commit_message>
<xml_diff>
--- a/docs/BAO_CAO_SRS_SO_BO_VA_WBS_NHOM_DANG_DINH_KHANG.docx
+++ b/docs/BAO_CAO_SRS_SO_BO_VA_WBS_NHOM_DANG_DINH_KHANG.docx
@@ -1578,7 +1578,7 @@
           </w:tcPr>
           <w:p>
             <w:r>
-              <w:t>Hiện thực hóa Core API Xe vào Cổng 1 &amp; Xe ra Trạm B/C/AE (Khớp biển)</w:t>
+              <w:t>Hiện thực hóa Core API Xe vào Cổng 1 &amp; Xe ra Trạm C (bốt 2 làn), Trạm B (4 làn), Trạm A-E</w:t>
             </w:r>
           </w:p>
         </w:tc>
@@ -1610,7 +1610,7 @@
           </w:tcPr>
           <w:p>
             <w:r>
-              <w:t>backend/parking_service.py &amp; API routes</w:t>
+              <w:t>backend/parking_service.py &amp; Barrier Auto-open</w:t>
             </w:r>
           </w:p>
         </w:tc>
@@ -1644,7 +1644,7 @@
           </w:tcPr>
           <w:p>
             <w:r>
-              <w:t>Phát triển module Tính phí đồng giá 5k &amp; Phụ phí qua đêm 5k (Tổng 10k)</w:t>
+              <w:t>Module Tính phí đồng giá 5k, Phụ phí qua đêm 5k &amp; Miễn phí 100% Cán bộ - Giảng viên (0đ)</w:t>
             </w:r>
           </w:p>
         </w:tc>
@@ -1842,7 +1842,7 @@
           </w:tcPr>
           <w:p>
             <w:r>
-              <w:t>Xây dựng Thuật toán Điều phối Làn linh hoạt &amp; Đếm sức chứa 4 khu</w:t>
+              <w:t>Thuật toán Điều phối đỗ xe ưu tiên B -&gt; C -&gt; A -&gt; E &amp; Quản lý sức chứa 2.100 xe</w:t>
             </w:r>
           </w:p>
         </w:tc>
@@ -1974,7 +1974,7 @@
           </w:tcPr>
           <w:p>
             <w:r>
-              <w:t>Thiết kế Modal Popup hiển thị Mã VietQR 5k/10k tự động khi xe ra</w:t>
+              <w:t>Phát triển Màn hình phụ Customer Display (Đồng bộ VietQR Napas 247 &amp; Badge Miễn phí Cán bộ)</w:t>
             </w:r>
           </w:p>
         </w:tc>
@@ -2006,7 +2006,7 @@
           </w:tcPr>
           <w:p>
             <w:r>
-              <w:t>Giao diện thanh toán QR</w:t>
+              <w:t>frontend/web/customer_display.html</w:t>
             </w:r>
           </w:p>
         </w:tc>
@@ -2304,7 +2304,7 @@
           </w:tcPr>
           <w:p>
             <w:r>
-              <w:t>Viết Unit Test và Integration Test tự động bằng pytest (&gt;40 test cases)</w:t>
+              <w:t>Xây dựng Bộ kiểm thử tự động hóa toàn diện bằng pytest (267/267 test cases đạt 100% pass)</w:t>
             </w:r>
           </w:p>
         </w:tc>
@@ -2336,7 +2336,7 @@
           </w:tcPr>
           <w:p>
             <w:r>
-              <w:t>Thư mục tests/ tự động hóa</w:t>
+              <w:t>Thư mục tests/ tự động hóa (267 tests)</w:t>
             </w:r>
           </w:p>
         </w:tc>

</xml_diff>